<commit_message>
Updated Setback Temperature template
</commit_message>
<xml_diff>
--- a/HVAC/Programmable Thermostat/template.docx
+++ b/HVAC/Programmable Thermostat/template.docx
@@ -514,7 +514,7 @@
         <w:t>${</w:t>
       </w:r>
       <w:r>
-        <w:t>P</w:t>
+        <w:t>O</w:t>
       </w:r>
       <w:r>
         <w:t>HR}</w:t>
@@ -532,7 +532,7 @@
         <w:t>${</w:t>
       </w:r>
       <w:r>
-        <w:t>P</w:t>
+        <w:t>O</w:t>
       </w:r>
       <w:r>
         <w:t>DY}</w:t>
@@ -945,7 +945,25 @@
         <w:rPr>
           <w:bCs/>
         </w:rPr>
-        <w:t xml:space="preserve"> ×</w:t>
+        <w:t xml:space="preserve"> </w:t>
+      </w:r>
+      <w:r>
+        <w:rPr>
+          <w:bCs/>
+        </w:rPr>
+        <w:t>×</w:t>
+      </w:r>
+      <w:r>
+        <w:rPr>
+          <w:bCs/>
+        </w:rPr>
+        <w:t xml:space="preserve"> PA </w:t>
+      </w:r>
+      <w:r>
+        <w:rPr>
+          <w:bCs/>
+        </w:rPr>
+        <w:t>×</w:t>
       </w:r>
       <w:r>
         <w:rPr>
@@ -1187,6 +1205,12 @@
         </w:rPr>
         <w:t>${LF}</w:t>
       </w:r>
+      <w:r>
+        <w:rPr>
+          <w:bCs/>
+        </w:rPr>
+        <w:t>%</w:t>
+      </w:r>
     </w:p>
     <w:p>
       <w:pPr>
@@ -1202,55 +1226,14 @@
           <w:bCs/>
         </w:rPr>
         <w:tab/>
-      </w:r>
-      <w:r>
-        <w:rPr>
-          <w:bCs/>
-        </w:rPr>
-        <w:t>EER</w:t>
-      </w:r>
-      <w:r>
-        <w:rPr>
-          <w:bCs/>
-        </w:rPr>
-        <w:tab/>
-        <w:t>= Energy Efficiency Ratio</w:t>
-      </w:r>
-      <w:r>
-        <w:rPr>
-          <w:bCs/>
-        </w:rPr>
-        <w:t>:</w:t>
-      </w:r>
-      <w:r>
-        <w:rPr>
-          <w:bCs/>
-        </w:rPr>
-        <w:t xml:space="preserve"> </w:t>
-      </w:r>
-      <w:r>
-        <w:rPr>
-          <w:bCs/>
-        </w:rPr>
-        <w:t xml:space="preserve">${EER} </w:t>
-      </w:r>
-      <w:r>
-        <w:rPr>
-          <w:bCs/>
-        </w:rPr>
-        <w:t>B</w:t>
-      </w:r>
-      <w:r>
-        <w:rPr>
-          <w:bCs/>
-        </w:rPr>
-        <w:t>tu</w:t>
-      </w:r>
-      <w:r>
-        <w:rPr>
-          <w:bCs/>
-        </w:rPr>
-        <w:t>/hr/W</w:t>
+        <w:t xml:space="preserve">PA </w:t>
+      </w:r>
+      <w:r>
+        <w:rPr>
+          <w:bCs/>
+        </w:rPr>
+        <w:tab/>
+        <w:t>= Percentage of office area across all buildings: ${PA}%</w:t>
       </w:r>
     </w:p>
     <w:p>
@@ -1267,6 +1250,71 @@
           <w:bCs/>
         </w:rPr>
         <w:tab/>
+      </w:r>
+      <w:r>
+        <w:rPr>
+          <w:bCs/>
+        </w:rPr>
+        <w:t>EER</w:t>
+      </w:r>
+      <w:r>
+        <w:rPr>
+          <w:bCs/>
+        </w:rPr>
+        <w:tab/>
+        <w:t>= Energy Efficiency Ratio</w:t>
+      </w:r>
+      <w:r>
+        <w:rPr>
+          <w:bCs/>
+        </w:rPr>
+        <w:t>:</w:t>
+      </w:r>
+      <w:r>
+        <w:rPr>
+          <w:bCs/>
+        </w:rPr>
+        <w:t xml:space="preserve"> </w:t>
+      </w:r>
+      <w:r>
+        <w:rPr>
+          <w:bCs/>
+        </w:rPr>
+        <w:t xml:space="preserve">${EER} </w:t>
+      </w:r>
+      <w:r>
+        <w:rPr>
+          <w:bCs/>
+        </w:rPr>
+        <w:t>B</w:t>
+      </w:r>
+      <w:r>
+        <w:rPr>
+          <w:bCs/>
+        </w:rPr>
+        <w:t>tu</w:t>
+      </w:r>
+      <w:r>
+        <w:rPr>
+          <w:bCs/>
+        </w:rPr>
+        <w:t>/hr/W</w:t>
+      </w:r>
+    </w:p>
+    <w:p>
+      <w:pPr>
+        <w:pStyle w:val="BodyTextIndent"/>
+        <w:spacing w:line="360" w:lineRule="auto"/>
+        <w:ind w:firstLine="0"/>
+        <w:rPr>
+          <w:bCs/>
+        </w:rPr>
+      </w:pPr>
+      <w:r>
+        <w:rPr>
+          <w:bCs/>
+        </w:rPr>
+        <w:tab/>
         <w:t>C</w:t>
       </w:r>
       <w:r>
@@ -1346,6 +1394,24 @@
         <w:rPr>
           <w:bCs/>
         </w:rPr>
+        <w:t xml:space="preserve">${PA}% </w:t>
+      </w:r>
+      <w:r>
+        <w:rPr>
+          <w:bCs/>
+        </w:rPr>
+        <w:t>×</w:t>
+      </w:r>
+      <w:r>
+        <w:rPr>
+          <w:bCs/>
+        </w:rPr>
+        <w:t xml:space="preserve"> </w:t>
+      </w:r>
+      <w:r>
+        <w:rPr>
+          <w:bCs/>
+        </w:rPr>
         <w:t>12,000 B</w:t>
       </w:r>
       <w:r>
@@ -1597,7 +1663,19 @@
         <w:rPr>
           <w:color w:val="000000"/>
         </w:rPr>
-        <w:t>× OH</w:t>
+        <w:t xml:space="preserve">× </w:t>
+      </w:r>
+      <w:r>
+        <w:rPr>
+          <w:color w:val="000000"/>
+        </w:rPr>
+        <w:t>(</w:t>
+      </w:r>
+      <w:r>
+        <w:rPr>
+          <w:color w:val="000000"/>
+        </w:rPr>
+        <w:t>OH</w:t>
       </w:r>
       <w:r>
         <w:rPr>
@@ -1610,28 +1688,38 @@
         <w:rPr>
           <w:color w:val="000000"/>
         </w:rPr>
-        <w:t xml:space="preserve"> × </w:t>
-      </w:r>
-      <w:r>
-        <w:rPr>
-          <w:color w:val="000000"/>
-          <w:lang w:eastAsia="zh-CN"/>
-        </w:rPr>
-        <w:t xml:space="preserve">(1 - </w:t>
-      </w:r>
-      <w:r>
-        <w:rPr>
-          <w:color w:val="000000"/>
-          <w:lang w:eastAsia="zh-CN"/>
-        </w:rPr>
-        <w:t>M</w:t>
-      </w:r>
-      <w:r>
-        <w:rPr>
-          <w:color w:val="000000"/>
-          <w:lang w:eastAsia="zh-CN"/>
-        </w:rPr>
-        <w:t>CDH / CDH)</w:t>
+        <w:t xml:space="preserve"> </w:t>
+      </w:r>
+      <w:r>
+        <w:rPr>
+          <w:color w:val="000000"/>
+        </w:rPr>
+        <w:t>– OH</w:t>
+      </w:r>
+      <w:r>
+        <w:rPr>
+          <w:color w:val="000000"/>
+          <w:vertAlign w:val="subscript"/>
+        </w:rPr>
+        <w:t>O</w:t>
+      </w:r>
+      <w:r>
+        <w:rPr>
+          <w:color w:val="000000"/>
+        </w:rPr>
+        <w:t xml:space="preserve">) </w:t>
+      </w:r>
+      <w:r>
+        <w:rPr>
+          <w:color w:val="000000"/>
+        </w:rPr>
+        <w:t>×</w:t>
+      </w:r>
+      <w:r>
+        <w:rPr>
+          <w:color w:val="000000"/>
+        </w:rPr>
+        <w:t xml:space="preserve"> (1 – MCDH / CDH)</w:t>
       </w:r>
     </w:p>
     <w:p>
@@ -1713,7 +1801,7 @@
         <w:rPr>
           <w:color w:val="000000"/>
         </w:rPr>
-        <w:t>} hrs/year (${</w:t>
+        <w:t>} hrs/yr (${</w:t>
       </w:r>
       <w:r>
         <w:rPr>
@@ -1737,7 +1825,13 @@
         <w:rPr>
           <w:color w:val="000000"/>
         </w:rPr>
-        <w:t>day, ${</w:t>
+        <w:t>wk</w:t>
+      </w:r>
+      <w:r>
+        <w:rPr>
+          <w:color w:val="000000"/>
+        </w:rPr>
+        <w:t>, ${</w:t>
       </w:r>
       <w:r>
         <w:rPr>
@@ -1749,42 +1843,6 @@
         <w:rPr>
           <w:color w:val="000000"/>
         </w:rPr>
-        <w:t>DY}</w:t>
-      </w:r>
-      <w:r>
-        <w:rPr>
-          <w:color w:val="000000"/>
-        </w:rPr>
-        <w:t xml:space="preserve"> </w:t>
-      </w:r>
-      <w:r>
-        <w:rPr>
-          <w:color w:val="000000"/>
-        </w:rPr>
-        <w:t>days</w:t>
-      </w:r>
-      <w:r>
-        <w:rPr>
-          <w:color w:val="000000"/>
-        </w:rPr>
-        <w:t>/w</w:t>
-      </w:r>
-      <w:r>
-        <w:rPr>
-          <w:color w:val="000000"/>
-        </w:rPr>
-        <w:t>k, ${</w:t>
-      </w:r>
-      <w:r>
-        <w:rPr>
-          <w:color w:val="000000"/>
-        </w:rPr>
-        <w:t>C</w:t>
-      </w:r>
-      <w:r>
-        <w:rPr>
-          <w:color w:val="000000"/>
-        </w:rPr>
         <w:t>WK} wks</w:t>
       </w:r>
       <w:r>
@@ -1798,6 +1856,48 @@
           <w:color w:val="000000"/>
         </w:rPr>
         <w:t>yr)</w:t>
+      </w:r>
+    </w:p>
+    <w:p>
+      <w:pPr>
+        <w:pStyle w:val="BodyTextIndent"/>
+        <w:spacing w:line="360" w:lineRule="auto"/>
+        <w:ind w:left="1440" w:hanging="720"/>
+        <w:rPr>
+          <w:color w:val="000000"/>
+        </w:rPr>
+      </w:pPr>
+      <w:r>
+        <w:rPr>
+          <w:color w:val="000000"/>
+        </w:rPr>
+        <w:t>OH</w:t>
+      </w:r>
+      <w:r>
+        <w:rPr>
+          <w:color w:val="000000"/>
+          <w:vertAlign w:val="subscript"/>
+        </w:rPr>
+        <w:t>O</w:t>
+      </w:r>
+      <w:r>
+        <w:rPr>
+          <w:color w:val="000000"/>
+        </w:rPr>
+        <w:tab/>
+        <w:t>= Occupied operating hours: ${OHO}hrs/yr (${OHR} hrs/wk, ${</w:t>
+      </w:r>
+      <w:r>
+        <w:rPr>
+          <w:color w:val="000000"/>
+        </w:rPr>
+        <w:t>O</w:t>
+      </w:r>
+      <w:r>
+        <w:rPr>
+          <w:color w:val="000000"/>
+        </w:rPr>
+        <w:t>WK} wks/yr)</w:t>
       </w:r>
     </w:p>
     <w:p>
@@ -1817,7 +1917,13 @@
           <w:color w:val="000000"/>
         </w:rPr>
         <w:tab/>
-        <w:t>= Cooling degree hours</w:t>
+        <w:t xml:space="preserve">= Cooling degree </w:t>
+      </w:r>
+      <w:r>
+        <w:rPr>
+          <w:color w:val="000000"/>
+        </w:rPr>
+        <w:t>days</w:t>
       </w:r>
       <w:r>
         <w:rPr>
@@ -1841,7 +1947,10 @@
         <w:sym w:font="Symbol" w:char="F0D7"/>
       </w:r>
       <w:r>
-        <w:t>hr/yr</w:t>
+        <w:t>days</w:t>
+      </w:r>
+      <w:r>
+        <w:t>/yr</w:t>
       </w:r>
     </w:p>
     <w:p>
@@ -1853,8 +1962,15 @@
         <w:rPr>
           <w:color w:val="000000"/>
         </w:rPr>
-        <w:tab/>
-        <w:t>MCDH= Modified cooling degree hours</w:t>
+        <w:lastRenderedPageBreak/>
+        <w:tab/>
+        <w:t xml:space="preserve">MCDH= Modified cooling degree </w:t>
+      </w:r>
+      <w:r>
+        <w:rPr>
+          <w:color w:val="000000"/>
+        </w:rPr>
+        <w:t>days</w:t>
       </w:r>
       <w:r>
         <w:rPr>
@@ -1890,7 +2006,10 @@
         <w:sym w:font="Symbol" w:char="F0D7"/>
       </w:r>
       <w:r>
-        <w:t>hr/yr</w:t>
+        <w:t>days</w:t>
+      </w:r>
+      <w:r>
+        <w:t>/yr</w:t>
       </w:r>
     </w:p>
     <w:p>
@@ -1938,13 +2057,25 @@
         <w:rPr>
           <w:color w:val="000000"/>
         </w:rPr>
-        <w:t xml:space="preserve">/year × </w:t>
-      </w:r>
-      <w:r>
-        <w:rPr>
-          <w:color w:val="000000"/>
-        </w:rPr>
-        <w:t xml:space="preserve">(1 - </w:t>
+        <w:t xml:space="preserve">/yr × </w:t>
+      </w:r>
+      <w:r>
+        <w:rPr>
+          <w:color w:val="000000"/>
+        </w:rPr>
+        <w:t xml:space="preserve">${OHO} hrs/yr × </w:t>
+      </w:r>
+      <w:r>
+        <w:rPr>
+          <w:color w:val="000000"/>
+        </w:rPr>
+        <w:t>(1</w:t>
+      </w:r>
+      <w:r>
+        <w:rPr>
+          <w:color w:val="000000"/>
+        </w:rPr>
+        <w:t xml:space="preserve"> – </w:t>
       </w:r>
       <w:r>
         <w:rPr>
@@ -2056,7 +2187,6 @@
         <w:spacing w:before="120" w:line="360" w:lineRule="auto"/>
       </w:pPr>
       <w:r>
-        <w:lastRenderedPageBreak/>
         <w:t>&lt;HEAT&gt;</w:t>
       </w:r>
       <w:r>
@@ -2249,12 +2379,6 @@
         </w:rPr>
         <w:t xml:space="preserve"> (1 - MHDH / HDH)</w:t>
       </w:r>
-      <w:r>
-        <w:rPr>
-          <w:szCs w:val="22"/>
-        </w:rPr>
-        <w:t>,</w:t>
-      </w:r>
     </w:p>
     <w:p>
       <w:pPr>
@@ -2308,7 +2432,10 @@
         <w:t xml:space="preserve">= </w:t>
       </w:r>
       <w:r>
-        <w:t>Cooling degree hours</w:t>
+        <w:t xml:space="preserve">Cooling degree </w:t>
+      </w:r>
+      <w:r>
+        <w:t>days</w:t>
       </w:r>
       <w:r>
         <w:t>:</w:t>
@@ -2323,7 +2450,10 @@
         <w:sym w:font="Symbol" w:char="F0D7"/>
       </w:r>
       <w:r>
-        <w:t>hr/yr</w:t>
+        <w:t>days</w:t>
+      </w:r>
+      <w:r>
+        <w:t>/yr</w:t>
       </w:r>
     </w:p>
     <w:p>
@@ -2350,7 +2480,10 @@
         <w:t xml:space="preserve">= </w:t>
       </w:r>
       <w:r>
-        <w:t>Modified cooling degree hours</w:t>
+        <w:t xml:space="preserve">Modified cooling degree </w:t>
+      </w:r>
+      <w:r>
+        <w:t>days</w:t>
       </w:r>
       <w:r>
         <w:t>:</w:t>
@@ -2365,7 +2498,10 @@
         <w:sym w:font="Symbol" w:char="F0D7"/>
       </w:r>
       <w:r>
-        <w:t>hr/yr</w:t>
+        <w:t>days</w:t>
+      </w:r>
+      <w:r>
+        <w:t>/yr</w:t>
       </w:r>
     </w:p>
     <w:p>
@@ -2508,7 +2644,10 @@
         <w:sym w:font="Symbol" w:char="F0D7"/>
       </w:r>
       <w:r>
-        <w:t>hr/yr / ${HDH} deg</w:t>
+        <w:t>days</w:t>
+      </w:r>
+      <w:r>
+        <w:t>/yr / ${HDH} deg</w:t>
       </w:r>
       <w:r>
         <w:rPr>
@@ -2517,7 +2656,10 @@
         <w:sym w:font="Symbol" w:char="F0D7"/>
       </w:r>
       <w:r>
-        <w:t>hr/yr)</w:t>
+        <w:t>days</w:t>
+      </w:r>
+      <w:r>
+        <w:t>/yr)</w:t>
       </w:r>
     </w:p>
     <w:p>
@@ -3266,7 +3408,11 @@
         <w:t xml:space="preserve"> for each thermostat</w:t>
       </w:r>
       <w:r>
-        <w:t xml:space="preserve">, with an in-house labor rate of </w:t>
+        <w:t xml:space="preserve">, with </w:t>
+      </w:r>
+      <w:r>
+        <w:lastRenderedPageBreak/>
+        <w:t xml:space="preserve">an in-house labor rate of </w:t>
       </w:r>
       <w:r>
         <w:t>$</w:t>
@@ -3335,7 +3481,6 @@
           <w:b/>
           <w:bCs/>
         </w:rPr>
-        <w:lastRenderedPageBreak/>
         <w:tab/>
       </w:r>
       <w:r>

</xml_diff>

<commit_message>
minor modifications to 2 templates and gitignore files
</commit_message>
<xml_diff>
--- a/HVAC/Programmable Thermostat/template.docx
+++ b/HVAC/Programmable Thermostat/template.docx
@@ -526,19 +526,13 @@
         <w:t xml:space="preserve"> </w:t>
       </w:r>
       <w:r>
-        <w:t xml:space="preserve">hours per day, </w:t>
-      </w:r>
-      <w:r>
-        <w:t>${</w:t>
-      </w:r>
-      <w:r>
-        <w:t>O</w:t>
-      </w:r>
-      <w:r>
-        <w:t>DY}</w:t>
-      </w:r>
-      <w:r>
-        <w:t xml:space="preserve"> days per week. </w:t>
+        <w:t xml:space="preserve">hours per </w:t>
+      </w:r>
+      <w:r>
+        <w:t>week</w:t>
+      </w:r>
+      <w:r>
+        <w:t xml:space="preserve">. </w:t>
       </w:r>
       <w:r>
         <w:t>Much ene</w:t>
@@ -794,43 +788,37 @@
         <w:rPr>
           <w:bCs/>
         </w:rPr>
-        <w:t xml:space="preserve">.  Estimates for energy conservation </w:t>
+        <w:t xml:space="preserve">.  Estimates for energy conservation are based upon the number of </w:t>
+      </w:r>
+      <w:r>
+        <w:rPr>
+          <w:bCs/>
+        </w:rPr>
+        <w:t>cooling</w:t>
+      </w:r>
+      <w:r>
+        <w:rPr>
+          <w:bCs/>
+        </w:rPr>
+        <w:t xml:space="preserve"> degree </w:t>
+      </w:r>
+      <w:r>
+        <w:rPr>
+          <w:bCs/>
+        </w:rPr>
+        <w:t>hours</w:t>
+      </w:r>
+      <w:r>
+        <w:rPr>
+          <w:bCs/>
+        </w:rPr>
+        <w:t xml:space="preserve"> saved. Our calculations take into </w:t>
       </w:r>
       <w:r>
         <w:rPr>
           <w:bCs/>
         </w:rPr>
         <w:lastRenderedPageBreak/>
-        <w:t xml:space="preserve">are based upon the number of </w:t>
-      </w:r>
-      <w:r>
-        <w:rPr>
-          <w:bCs/>
-        </w:rPr>
-        <w:t>cooling</w:t>
-      </w:r>
-      <w:r>
-        <w:rPr>
-          <w:bCs/>
-        </w:rPr>
-        <w:t xml:space="preserve"> degree </w:t>
-      </w:r>
-      <w:r>
-        <w:rPr>
-          <w:bCs/>
-        </w:rPr>
-        <w:t>hours</w:t>
-      </w:r>
-      <w:r>
-        <w:rPr>
-          <w:bCs/>
-        </w:rPr>
-        <w:t xml:space="preserve"> saved. Our calculations take into </w:t>
-      </w:r>
-      <w:r>
-        <w:rPr>
-          <w:bCs/>
-        </w:rPr>
         <w:t>consideration</w:t>
       </w:r>
       <w:r>
@@ -1436,7 +1424,19 @@
         <w:rPr>
           <w:bCs/>
         </w:rPr>
-        <w:t>${LF} / (${</w:t>
+        <w:t>${LF}</w:t>
+      </w:r>
+      <w:r>
+        <w:rPr>
+          <w:bCs/>
+        </w:rPr>
+        <w:t>%</w:t>
+      </w:r>
+      <w:r>
+        <w:rPr>
+          <w:bCs/>
+        </w:rPr>
+        <w:t xml:space="preserve"> / (${</w:t>
       </w:r>
       <w:r>
         <w:rPr>
@@ -1962,7 +1962,6 @@
         <w:rPr>
           <w:color w:val="000000"/>
         </w:rPr>
-        <w:lastRenderedPageBreak/>
         <w:tab/>
         <w:t xml:space="preserve">MCDH= Modified cooling degree </w:t>
       </w:r>
@@ -2025,6 +2024,7 @@
         <w:rPr>
           <w:color w:val="000000"/>
         </w:rPr>
+        <w:lastRenderedPageBreak/>
         <w:tab/>
         <w:t>ES</w:t>
       </w:r>

</xml_diff>